<commit_message>
small grammer edits; sending to co-authors
</commit_message>
<xml_diff>
--- a/coverletter.docx
+++ b/coverletter.docx
@@ -267,7 +267,23 @@
           <w:sz w:val="22"/>
           <w:szCs w:val="22"/>
         </w:rPr>
-        <w:t xml:space="preserve"> is its ability to account for longitudinal patient histories. Chronic conditions such as cancer or diabetes are therefore flagged not only at the encounter where they are coded but across subsequent encounters in a patient’s record, improving the sensitivity of comorbidity identification compared with encounter-level approaches.</w:t>
+        <w:t xml:space="preserve"> is its ability to account for longitudinal patient histories. </w:t>
+      </w:r>
+      <w:r>
+        <w:rPr>
+          <w:rFonts w:ascii="Garamond" w:hAnsi="Garamond"/>
+          <w:sz w:val="22"/>
+          <w:szCs w:val="22"/>
+        </w:rPr>
+        <w:t>Chronic conditions such as cancer or diabetes are flagged not only at the encounter where they are coded but across subsequent encounters in a patient’s record</w:t>
+      </w:r>
+      <w:r>
+        <w:rPr>
+          <w:rFonts w:ascii="Garamond" w:hAnsi="Garamond"/>
+          <w:sz w:val="22"/>
+          <w:szCs w:val="22"/>
+        </w:rPr>
+        <w:t>, improving the sensitivity of comorbidity identification compared with encounter-level approaches.</w:t>
       </w:r>
     </w:p>
     <w:p>
@@ -1093,7 +1109,6 @@
   <w:style w:type="character" w:default="1" w:styleId="DefaultParagraphFont">
     <w:name w:val="Default Paragraph Font"/>
     <w:uiPriority w:val="1"/>
-    <w:semiHidden/>
     <w:unhideWhenUsed/>
   </w:style>
   <w:style w:type="table" w:default="1" w:styleId="TableNormal">

</xml_diff>

<commit_message>
update coverletter; fix some grammer in manuscript
</commit_message>
<xml_diff>
--- a/coverletter.docx
+++ b/coverletter.docx
@@ -356,7 +356,7 @@
           <w:sz w:val="22"/>
           <w:szCs w:val="22"/>
         </w:rPr>
-        <w:t>Please address all correspondence concerning this application note to me at peter.dewitt@cuanschutz.edu.</w:t>
+        <w:t>Thank you for your consideration of this application note.</w:t>
       </w:r>
     </w:p>
     <w:p>
@@ -374,7 +374,7 @@
           <w:sz w:val="22"/>
           <w:szCs w:val="22"/>
         </w:rPr>
-        <w:t>Thank you for your consideration of this application note.</w:t>
+        <w:t>Sincerely,</w:t>
       </w:r>
     </w:p>
     <w:p>
@@ -386,14 +386,6 @@
           <w:szCs w:val="22"/>
         </w:rPr>
       </w:pPr>
-      <w:r>
-        <w:rPr>
-          <w:rFonts w:ascii="Garamond" w:hAnsi="Garamond"/>
-          <w:sz w:val="22"/>
-          <w:szCs w:val="22"/>
-        </w:rPr>
-        <w:t>Sincerely,</w:t>
-      </w:r>
     </w:p>
     <w:p>
       <w:pPr>
@@ -404,6 +396,46 @@
           <w:szCs w:val="22"/>
         </w:rPr>
       </w:pPr>
+      <w:r>
+        <w:rPr>
+          <w:rFonts w:ascii="Garamond" w:hAnsi="Garamond"/>
+          <w:sz w:val="22"/>
+          <w:szCs w:val="22"/>
+        </w:rPr>
+        <w:t>Peter E. DeWitt, PhD</w:t>
+      </w:r>
+      <w:r>
+        <w:rPr>
+          <w:rFonts w:ascii="Garamond" w:hAnsi="Garamond"/>
+          <w:sz w:val="22"/>
+          <w:szCs w:val="22"/>
+        </w:rPr>
+        <w:br/>
+      </w:r>
+      <w:r>
+        <w:rPr>
+          <w:rFonts w:ascii="Garamond" w:hAnsi="Garamond"/>
+          <w:sz w:val="22"/>
+          <w:szCs w:val="22"/>
+        </w:rPr>
+        <w:t>Assistant Research Professor</w:t>
+      </w:r>
+      <w:r>
+        <w:rPr>
+          <w:rFonts w:ascii="Garamond" w:hAnsi="Garamond"/>
+          <w:sz w:val="22"/>
+          <w:szCs w:val="22"/>
+        </w:rPr>
+        <w:br/>
+      </w:r>
+      <w:r>
+        <w:rPr>
+          <w:rFonts w:ascii="Garamond" w:hAnsi="Garamond"/>
+          <w:sz w:val="22"/>
+          <w:szCs w:val="22"/>
+        </w:rPr>
+        <w:t>peter.dewitt@cuanschutz.edu</w:t>
+      </w:r>
     </w:p>
     <w:p>
       <w:pPr>
@@ -420,39 +452,7 @@
           <w:sz w:val="22"/>
           <w:szCs w:val="22"/>
         </w:rPr>
-        <w:t>Peter E. DeWitt, PhD</w:t>
-      </w:r>
-      <w:r>
-        <w:rPr>
-          <w:rFonts w:ascii="Garamond" w:hAnsi="Garamond"/>
-          <w:sz w:val="22"/>
-          <w:szCs w:val="22"/>
-        </w:rPr>
-        <w:br/>
-      </w:r>
-      <w:r>
-        <w:rPr>
-          <w:rFonts w:ascii="Garamond" w:hAnsi="Garamond"/>
-          <w:sz w:val="22"/>
-          <w:szCs w:val="22"/>
-        </w:rPr>
-        <w:t>Assistant Research Professor</w:t>
-      </w:r>
-      <w:r>
-        <w:rPr>
-          <w:rFonts w:ascii="Garamond" w:hAnsi="Garamond"/>
-          <w:sz w:val="22"/>
-          <w:szCs w:val="22"/>
-        </w:rPr>
-        <w:br/>
-      </w:r>
-      <w:r>
-        <w:rPr>
-          <w:rFonts w:ascii="Garamond" w:hAnsi="Garamond"/>
-          <w:sz w:val="22"/>
-          <w:szCs w:val="22"/>
-        </w:rPr>
-        <w:t>peter.dewitt@cuanschutz.edu</w:t>
+        <w:t xml:space="preserve">On behalf of co-authors: </w:t>
       </w:r>
     </w:p>
     <w:p>
@@ -470,24 +470,6 @@
           <w:sz w:val="22"/>
           <w:szCs w:val="22"/>
         </w:rPr>
-        <w:t xml:space="preserve">On behalf of co-authors: </w:t>
-      </w:r>
-    </w:p>
-    <w:p>
-      <w:pPr>
-        <w:pStyle w:val="NormalWeb"/>
-        <w:rPr>
-          <w:rFonts w:ascii="Garamond" w:hAnsi="Garamond"/>
-          <w:sz w:val="22"/>
-          <w:szCs w:val="22"/>
-        </w:rPr>
-      </w:pPr>
-      <w:r>
-        <w:rPr>
-          <w:rFonts w:ascii="Garamond" w:hAnsi="Garamond"/>
-          <w:sz w:val="22"/>
-          <w:szCs w:val="22"/>
-        </w:rPr>
         <w:t>Seth Russell, MS</w:t>
       </w:r>
       <w:r>
@@ -497,6 +479,14 @@
           <w:szCs w:val="22"/>
         </w:rPr>
         <w:t xml:space="preserve">; </w:t>
+      </w:r>
+      <w:r>
+        <w:rPr>
+          <w:rFonts w:ascii="Garamond" w:hAnsi="Garamond"/>
+          <w:sz w:val="22"/>
+          <w:szCs w:val="22"/>
+        </w:rPr>
+        <w:t xml:space="preserve">James A. Feinstein, MD, MPH; </w:t>
       </w:r>
       <w:r>
         <w:rPr>
@@ -1109,6 +1099,7 @@
   <w:style w:type="character" w:default="1" w:styleId="DefaultParagraphFont">
     <w:name w:val="Default Paragraph Font"/>
     <w:uiPriority w:val="1"/>
+    <w:semiHidden/>
     <w:unhideWhenUsed/>
   </w:style>
   <w:style w:type="table" w:default="1" w:styleId="TableNormal">

</xml_diff>

<commit_message>
update date in coverletter
</commit_message>
<xml_diff>
--- a/coverletter.docx
+++ b/coverletter.docx
@@ -83,7 +83,15 @@
           <w:sz w:val="22"/>
           <w:szCs w:val="22"/>
         </w:rPr>
-        <w:t>14 March 2026</w:t>
+        <w:t>26</w:t>
+      </w:r>
+      <w:r>
+        <w:rPr>
+          <w:rFonts w:ascii="Garamond" w:hAnsi="Garamond"/>
+          <w:sz w:val="22"/>
+          <w:szCs w:val="22"/>
+        </w:rPr>
+        <w:t xml:space="preserve"> March 2026</w:t>
       </w:r>
     </w:p>
     <w:p>

</xml_diff>